<commit_message>
Merge AMIS catalog into báo giá docx generation.
Load product master data from the AMIS export, match codes from uploaded templates, fill line items with real prices and images, mock remaining merge fields, and surface product preview/errors in the Streamlit UI.

Co-authored-by: Cursor <cursoragent@cursor.com>
</commit_message>
<xml_diff>
--- a/BG Quat ngang 2026.docx
+++ b/BG Quat ngang 2026.docx
@@ -2850,6 +2850,11 @@
     <w:p>
       <w:r>
         <w:t>Mã KH: DEMO001</w:t>
+      </w:r>
+    </w:p>
+    <w:p>
+      <w:r>
+        <w:t>Mã hàng: CV.P7/560/80/K1-0.75kW4P, SUS316; AVR.H4/6/350/K13-0.75KW2P</w:t>
       </w:r>
     </w:p>
     <w:sectPr>

</xml_diff>